<commit_message>
update syllabus and portfolio
</commit_message>
<xml_diff>
--- a/MECH151_techDesign/syllabusMECH151.docx
+++ b/MECH151_techDesign/syllabusMECH151.docx
@@ -75,14 +75,14 @@
         </w:tblCellMar>
       </w:tblPr>
       <w:tblGrid>
-        <w:gridCol w:w="2499"/>
-        <w:gridCol w:w="6981"/>
+        <w:gridCol w:w="2498"/>
+        <w:gridCol w:w="6982"/>
       </w:tblGrid>
       <w:tr>
         <w:trPr/>
         <w:tc>
           <w:tcPr>
-            <w:tcW w:w="2499" w:type="dxa"/>
+            <w:tcW w:w="2498" w:type="dxa"/>
             <w:tcBorders/>
           </w:tcPr>
           <w:p>
@@ -101,7 +101,7 @@
         </w:tc>
         <w:tc>
           <w:tcPr>
-            <w:tcW w:w="6981" w:type="dxa"/>
+            <w:tcW w:w="6982" w:type="dxa"/>
             <w:tcBorders/>
             <w:tcMar>
               <w:end w:w="0" w:type="dxa"/>
@@ -126,7 +126,7 @@
         <w:trPr/>
         <w:tc>
           <w:tcPr>
-            <w:tcW w:w="2499" w:type="dxa"/>
+            <w:tcW w:w="2498" w:type="dxa"/>
             <w:tcBorders/>
           </w:tcPr>
           <w:p>
@@ -145,7 +145,7 @@
         </w:tc>
         <w:tc>
           <w:tcPr>
-            <w:tcW w:w="6981" w:type="dxa"/>
+            <w:tcW w:w="6982" w:type="dxa"/>
             <w:tcBorders/>
             <w:tcMar>
               <w:end w:w="0" w:type="dxa"/>
@@ -170,7 +170,7 @@
         <w:trPr/>
         <w:tc>
           <w:tcPr>
-            <w:tcW w:w="2499" w:type="dxa"/>
+            <w:tcW w:w="2498" w:type="dxa"/>
             <w:tcBorders/>
           </w:tcPr>
           <w:p>
@@ -189,7 +189,7 @@
         </w:tc>
         <w:tc>
           <w:tcPr>
-            <w:tcW w:w="6981" w:type="dxa"/>
+            <w:tcW w:w="6982" w:type="dxa"/>
             <w:tcBorders/>
             <w:tcMar>
               <w:end w:w="0" w:type="dxa"/>
@@ -271,14 +271,14 @@
         </w:tblCellMar>
       </w:tblPr>
       <w:tblGrid>
-        <w:gridCol w:w="2499"/>
-        <w:gridCol w:w="6981"/>
+        <w:gridCol w:w="2498"/>
+        <w:gridCol w:w="6982"/>
       </w:tblGrid>
       <w:tr>
         <w:trPr/>
         <w:tc>
           <w:tcPr>
-            <w:tcW w:w="2499" w:type="dxa"/>
+            <w:tcW w:w="2498" w:type="dxa"/>
             <w:tcBorders/>
           </w:tcPr>
           <w:p>
@@ -297,7 +297,7 @@
         </w:tc>
         <w:tc>
           <w:tcPr>
-            <w:tcW w:w="6981" w:type="dxa"/>
+            <w:tcW w:w="6982" w:type="dxa"/>
             <w:tcBorders/>
             <w:tcMar>
               <w:end w:w="0" w:type="dxa"/>
@@ -322,7 +322,7 @@
         <w:trPr/>
         <w:tc>
           <w:tcPr>
-            <w:tcW w:w="2499" w:type="dxa"/>
+            <w:tcW w:w="2498" w:type="dxa"/>
             <w:tcBorders/>
           </w:tcPr>
           <w:p>
@@ -341,7 +341,7 @@
         </w:tc>
         <w:tc>
           <w:tcPr>
-            <w:tcW w:w="6981" w:type="dxa"/>
+            <w:tcW w:w="6982" w:type="dxa"/>
             <w:tcBorders/>
             <w:tcMar>
               <w:end w:w="0" w:type="dxa"/>
@@ -366,7 +366,7 @@
         <w:trPr/>
         <w:tc>
           <w:tcPr>
-            <w:tcW w:w="2499" w:type="dxa"/>
+            <w:tcW w:w="2498" w:type="dxa"/>
             <w:tcBorders/>
           </w:tcPr>
           <w:p>
@@ -385,7 +385,7 @@
         </w:tc>
         <w:tc>
           <w:tcPr>
-            <w:tcW w:w="6981" w:type="dxa"/>
+            <w:tcW w:w="6982" w:type="dxa"/>
             <w:tcBorders/>
             <w:tcMar>
               <w:end w:w="0" w:type="dxa"/>
@@ -410,7 +410,7 @@
         <w:trPr/>
         <w:tc>
           <w:tcPr>
-            <w:tcW w:w="2499" w:type="dxa"/>
+            <w:tcW w:w="2498" w:type="dxa"/>
             <w:tcBorders/>
           </w:tcPr>
           <w:p>
@@ -429,7 +429,7 @@
         </w:tc>
         <w:tc>
           <w:tcPr>
-            <w:tcW w:w="6981" w:type="dxa"/>
+            <w:tcW w:w="6982" w:type="dxa"/>
             <w:tcBorders/>
             <w:tcMar>
               <w:end w:w="0" w:type="dxa"/>
@@ -454,7 +454,7 @@
         <w:trPr/>
         <w:tc>
           <w:tcPr>
-            <w:tcW w:w="2499" w:type="dxa"/>
+            <w:tcW w:w="2498" w:type="dxa"/>
             <w:tcBorders/>
           </w:tcPr>
           <w:p>
@@ -473,7 +473,7 @@
         </w:tc>
         <w:tc>
           <w:tcPr>
-            <w:tcW w:w="6981" w:type="dxa"/>
+            <w:tcW w:w="6982" w:type="dxa"/>
             <w:tcBorders/>
             <w:tcMar>
               <w:end w:w="0" w:type="dxa"/>
@@ -517,7 +517,7 @@
         <w:trPr/>
         <w:tc>
           <w:tcPr>
-            <w:tcW w:w="2499" w:type="dxa"/>
+            <w:tcW w:w="2498" w:type="dxa"/>
             <w:tcBorders/>
           </w:tcPr>
           <w:p>
@@ -536,7 +536,7 @@
         </w:tc>
         <w:tc>
           <w:tcPr>
-            <w:tcW w:w="6981" w:type="dxa"/>
+            <w:tcW w:w="6982" w:type="dxa"/>
             <w:tcBorders/>
             <w:tcMar>
               <w:end w:w="0" w:type="dxa"/>
@@ -561,7 +561,7 @@
         <w:trPr/>
         <w:tc>
           <w:tcPr>
-            <w:tcW w:w="2499" w:type="dxa"/>
+            <w:tcW w:w="2498" w:type="dxa"/>
             <w:tcBorders/>
           </w:tcPr>
           <w:p>
@@ -580,7 +580,7 @@
         </w:tc>
         <w:tc>
           <w:tcPr>
-            <w:tcW w:w="6981" w:type="dxa"/>
+            <w:tcW w:w="6982" w:type="dxa"/>
             <w:tcBorders/>
             <w:tcMar>
               <w:end w:w="0" w:type="dxa"/>
@@ -605,7 +605,7 @@
         <w:trPr/>
         <w:tc>
           <w:tcPr>
-            <w:tcW w:w="2499" w:type="dxa"/>
+            <w:tcW w:w="2498" w:type="dxa"/>
             <w:tcBorders/>
           </w:tcPr>
           <w:p>
@@ -624,7 +624,7 @@
         </w:tc>
         <w:tc>
           <w:tcPr>
-            <w:tcW w:w="6981" w:type="dxa"/>
+            <w:tcW w:w="6982" w:type="dxa"/>
             <w:tcBorders/>
             <w:tcMar>
               <w:end w:w="0" w:type="dxa"/>
@@ -1136,7 +1136,7 @@
         <w:pStyle w:val="ListParagraph"/>
         <w:numPr>
           <w:ilvl w:val="0"/>
-          <w:numId w:val="3"/>
+          <w:numId w:val="4"/>
         </w:numPr>
         <w:spacing w:before="0" w:after="100"/>
         <w:rPr>
@@ -1157,7 +1157,7 @@
         <w:pStyle w:val="ListParagraph"/>
         <w:numPr>
           <w:ilvl w:val="0"/>
-          <w:numId w:val="1"/>
+          <w:numId w:val="2"/>
         </w:numPr>
         <w:spacing w:before="0" w:after="100"/>
         <w:rPr>
@@ -1178,7 +1178,7 @@
         <w:pStyle w:val="ListParagraph"/>
         <w:numPr>
           <w:ilvl w:val="0"/>
-          <w:numId w:val="1"/>
+          <w:numId w:val="2"/>
         </w:numPr>
         <w:spacing w:before="0" w:after="100"/>
         <w:rPr>
@@ -1199,7 +1199,7 @@
         <w:pStyle w:val="ListParagraph"/>
         <w:numPr>
           <w:ilvl w:val="0"/>
-          <w:numId w:val="1"/>
+          <w:numId w:val="2"/>
         </w:numPr>
         <w:spacing w:before="0" w:after="100"/>
         <w:rPr>
@@ -1220,7 +1220,7 @@
         <w:pStyle w:val="ListParagraph"/>
         <w:numPr>
           <w:ilvl w:val="0"/>
-          <w:numId w:val="1"/>
+          <w:numId w:val="2"/>
         </w:numPr>
         <w:spacing w:before="0" w:after="100"/>
         <w:rPr>
@@ -1381,49 +1381,7 @@
           <w:sz w:val="22"/>
           <w:szCs w:val="22"/>
         </w:rPr>
-        <w:t xml:space="preserve">This course combines lecture instruction with hands-on CAD/CAM lab work and machine operation. </w:t>
-      </w:r>
-      <w:r>
-        <w:rPr>
-          <w:sz w:val="22"/>
-          <w:szCs w:val="22"/>
-        </w:rPr>
-        <w:t>L</w:t>
-      </w:r>
-      <w:r>
-        <w:rPr>
-          <w:sz w:val="22"/>
-          <w:szCs w:val="22"/>
-        </w:rPr>
-        <w:t xml:space="preserve">ab activities require that all participants wear proper PPE as designated by the instructor. Failure to have the proper PPE during machine use will result in the participant being asked to leave the </w:t>
-      </w:r>
-      <w:r>
-        <w:rPr>
-          <w:sz w:val="22"/>
-          <w:szCs w:val="22"/>
-        </w:rPr>
-        <w:t>class</w:t>
-      </w:r>
-      <w:r>
-        <w:rPr>
-          <w:sz w:val="22"/>
-          <w:szCs w:val="22"/>
-        </w:rPr>
-        <w:t xml:space="preserve">. Accommodations will be handled on a case-by-case matter and </w:t>
-      </w:r>
-      <w:r>
-        <w:rPr>
-          <w:sz w:val="22"/>
-          <w:szCs w:val="22"/>
-        </w:rPr>
-        <w:t xml:space="preserve">should </w:t>
-      </w:r>
-      <w:r>
-        <w:rPr>
-          <w:sz w:val="22"/>
-          <w:szCs w:val="22"/>
-        </w:rPr>
-        <w:t>be requested from the student to the instructor with as much notice as possible.</w:t>
+        <w:t>This course combines lecture instruction with hands-on CAD/CAM lab work and machine operation. Lab activities require that all participants wear proper PPE as designated by the instructor. Failure to have the proper PPE during machine use will result in the participant being asked to leave the class. Accommodations will be handled on a case-by-case matter and should be requested from the student to the instructor with as much notice as possible.</w:t>
       </w:r>
     </w:p>
     <w:p>
@@ -1469,16 +1427,16 @@
         </w:tblCellMar>
       </w:tblPr>
       <w:tblGrid>
-        <w:gridCol w:w="2899"/>
-        <w:gridCol w:w="2401"/>
-        <w:gridCol w:w="2399"/>
-        <w:gridCol w:w="1781"/>
+        <w:gridCol w:w="2898"/>
+        <w:gridCol w:w="2402"/>
+        <w:gridCol w:w="2398"/>
+        <w:gridCol w:w="1782"/>
       </w:tblGrid>
       <w:tr>
         <w:trPr/>
         <w:tc>
           <w:tcPr>
-            <w:tcW w:w="2899" w:type="dxa"/>
+            <w:tcW w:w="2898" w:type="dxa"/>
             <w:tcBorders>
               <w:top w:val="single" w:sz="4" w:space="0" w:color="000000"/>
             </w:tcBorders>
@@ -1502,7 +1460,7 @@
         </w:tc>
         <w:tc>
           <w:tcPr>
-            <w:tcW w:w="2401" w:type="dxa"/>
+            <w:tcW w:w="2402" w:type="dxa"/>
             <w:tcBorders>
               <w:top w:val="single" w:sz="4" w:space="0" w:color="000000"/>
             </w:tcBorders>
@@ -1526,7 +1484,7 @@
         </w:tc>
         <w:tc>
           <w:tcPr>
-            <w:tcW w:w="2399" w:type="dxa"/>
+            <w:tcW w:w="2398" w:type="dxa"/>
             <w:tcBorders>
               <w:top w:val="single" w:sz="4" w:space="0" w:color="000000"/>
             </w:tcBorders>
@@ -1550,7 +1508,7 @@
         </w:tc>
         <w:tc>
           <w:tcPr>
-            <w:tcW w:w="1781" w:type="dxa"/>
+            <w:tcW w:w="1782" w:type="dxa"/>
             <w:tcBorders>
               <w:top w:val="single" w:sz="4" w:space="0" w:color="000000"/>
             </w:tcBorders>
@@ -1577,7 +1535,7 @@
         <w:trPr/>
         <w:tc>
           <w:tcPr>
-            <w:tcW w:w="2899" w:type="dxa"/>
+            <w:tcW w:w="2898" w:type="dxa"/>
             <w:tcBorders/>
           </w:tcPr>
           <w:p>
@@ -1597,7 +1555,7 @@
         </w:tc>
         <w:tc>
           <w:tcPr>
-            <w:tcW w:w="2401" w:type="dxa"/>
+            <w:tcW w:w="2402" w:type="dxa"/>
             <w:tcBorders/>
           </w:tcPr>
           <w:p>
@@ -1617,7 +1575,7 @@
         </w:tc>
         <w:tc>
           <w:tcPr>
-            <w:tcW w:w="2399" w:type="dxa"/>
+            <w:tcW w:w="2398" w:type="dxa"/>
             <w:tcBorders/>
           </w:tcPr>
           <w:p>
@@ -1637,7 +1595,7 @@
         </w:tc>
         <w:tc>
           <w:tcPr>
-            <w:tcW w:w="1781" w:type="dxa"/>
+            <w:tcW w:w="1782" w:type="dxa"/>
             <w:tcBorders/>
           </w:tcPr>
           <w:p>
@@ -1660,7 +1618,7 @@
         <w:trPr/>
         <w:tc>
           <w:tcPr>
-            <w:tcW w:w="2899" w:type="dxa"/>
+            <w:tcW w:w="2898" w:type="dxa"/>
             <w:tcBorders/>
           </w:tcPr>
           <w:p>
@@ -1674,20 +1632,13 @@
                 <w:sz w:val="22"/>
                 <w:szCs w:val="22"/>
               </w:rPr>
-              <w:t xml:space="preserve">Design </w:t>
-            </w:r>
-            <w:r>
-              <w:rPr>
-                <w:sz w:val="22"/>
-                <w:szCs w:val="22"/>
-              </w:rPr>
-              <w:t>Portfolio</w:t>
-            </w:r>
-          </w:p>
-        </w:tc>
-        <w:tc>
-          <w:tcPr>
-            <w:tcW w:w="2401" w:type="dxa"/>
+              <w:t>Design Portfolio</w:t>
+            </w:r>
+          </w:p>
+        </w:tc>
+        <w:tc>
+          <w:tcPr>
+            <w:tcW w:w="2402" w:type="dxa"/>
             <w:tcBorders/>
           </w:tcPr>
           <w:p>
@@ -1707,7 +1658,7 @@
         </w:tc>
         <w:tc>
           <w:tcPr>
-            <w:tcW w:w="2399" w:type="dxa"/>
+            <w:tcW w:w="2398" w:type="dxa"/>
             <w:tcBorders/>
           </w:tcPr>
           <w:p>
@@ -1727,7 +1678,7 @@
         </w:tc>
         <w:tc>
           <w:tcPr>
-            <w:tcW w:w="1781" w:type="dxa"/>
+            <w:tcW w:w="1782" w:type="dxa"/>
             <w:tcBorders/>
           </w:tcPr>
           <w:p>
@@ -1750,7 +1701,7 @@
         <w:trPr/>
         <w:tc>
           <w:tcPr>
-            <w:tcW w:w="2899" w:type="dxa"/>
+            <w:tcW w:w="2898" w:type="dxa"/>
             <w:tcBorders/>
           </w:tcPr>
           <w:p>
@@ -1770,7 +1721,7 @@
         </w:tc>
         <w:tc>
           <w:tcPr>
-            <w:tcW w:w="2401" w:type="dxa"/>
+            <w:tcW w:w="2402" w:type="dxa"/>
             <w:tcBorders/>
           </w:tcPr>
           <w:p>
@@ -1790,7 +1741,7 @@
         </w:tc>
         <w:tc>
           <w:tcPr>
-            <w:tcW w:w="2399" w:type="dxa"/>
+            <w:tcW w:w="2398" w:type="dxa"/>
             <w:tcBorders/>
           </w:tcPr>
           <w:p>
@@ -1810,7 +1761,7 @@
         </w:tc>
         <w:tc>
           <w:tcPr>
-            <w:tcW w:w="1781" w:type="dxa"/>
+            <w:tcW w:w="1782" w:type="dxa"/>
             <w:tcBorders/>
           </w:tcPr>
           <w:p>
@@ -1833,7 +1784,7 @@
         <w:trPr/>
         <w:tc>
           <w:tcPr>
-            <w:tcW w:w="2899" w:type="dxa"/>
+            <w:tcW w:w="2898" w:type="dxa"/>
             <w:tcBorders/>
           </w:tcPr>
           <w:p>
@@ -1847,13 +1798,20 @@
                 <w:sz w:val="22"/>
                 <w:szCs w:val="22"/>
               </w:rPr>
-              <w:t>Prototype Project</w:t>
-            </w:r>
-          </w:p>
-        </w:tc>
-        <w:tc>
-          <w:tcPr>
-            <w:tcW w:w="2401" w:type="dxa"/>
+              <w:t xml:space="preserve">Prototype </w:t>
+            </w:r>
+            <w:r>
+              <w:rPr>
+                <w:sz w:val="22"/>
+                <w:szCs w:val="22"/>
+              </w:rPr>
+              <w:t>(Final Exam)</w:t>
+            </w:r>
+          </w:p>
+        </w:tc>
+        <w:tc>
+          <w:tcPr>
+            <w:tcW w:w="2402" w:type="dxa"/>
             <w:tcBorders/>
           </w:tcPr>
           <w:p>
@@ -1873,7 +1831,7 @@
         </w:tc>
         <w:tc>
           <w:tcPr>
-            <w:tcW w:w="2399" w:type="dxa"/>
+            <w:tcW w:w="2398" w:type="dxa"/>
             <w:tcBorders/>
           </w:tcPr>
           <w:p>
@@ -1893,7 +1851,7 @@
         </w:tc>
         <w:tc>
           <w:tcPr>
-            <w:tcW w:w="1781" w:type="dxa"/>
+            <w:tcW w:w="1782" w:type="dxa"/>
             <w:tcBorders/>
           </w:tcPr>
           <w:p>
@@ -1907,7 +1865,7 @@
                 <w:sz w:val="22"/>
                 <w:szCs w:val="22"/>
               </w:rPr>
-              <w:t>20%</w:t>
+              <w:t>30%</w:t>
             </w:r>
           </w:p>
         </w:tc>
@@ -1916,99 +1874,16 @@
         <w:trPr/>
         <w:tc>
           <w:tcPr>
-            <w:tcW w:w="2899" w:type="dxa"/>
-            <w:tcBorders/>
+            <w:tcW w:w="7698" w:type="dxa"/>
+            <w:gridSpan w:val="3"/>
+            <w:tcBorders>
+              <w:bottom w:val="single" w:sz="4" w:space="0" w:color="000000"/>
+            </w:tcBorders>
           </w:tcPr>
           <w:p>
             <w:pPr>
               <w:pStyle w:val="Normal"/>
               <w:jc w:val="start"/>
-              <w:rPr/>
-            </w:pPr>
-            <w:r>
-              <w:rPr>
-                <w:sz w:val="22"/>
-                <w:szCs w:val="22"/>
-              </w:rPr>
-              <w:t>Final Exam</w:t>
-            </w:r>
-          </w:p>
-        </w:tc>
-        <w:tc>
-          <w:tcPr>
-            <w:tcW w:w="2401" w:type="dxa"/>
-            <w:tcBorders/>
-          </w:tcPr>
-          <w:p>
-            <w:pPr>
-              <w:pStyle w:val="Normal"/>
-              <w:jc w:val="start"/>
-              <w:rPr/>
-            </w:pPr>
-            <w:r>
-              <w:rPr>
-                <w:sz w:val="22"/>
-                <w:szCs w:val="22"/>
-              </w:rPr>
-              <w:t>1</w:t>
-            </w:r>
-          </w:p>
-        </w:tc>
-        <w:tc>
-          <w:tcPr>
-            <w:tcW w:w="2399" w:type="dxa"/>
-            <w:tcBorders/>
-          </w:tcPr>
-          <w:p>
-            <w:pPr>
-              <w:pStyle w:val="Normal"/>
-              <w:jc w:val="start"/>
-              <w:rPr/>
-            </w:pPr>
-            <w:r>
-              <w:rPr>
-                <w:sz w:val="22"/>
-                <w:szCs w:val="22"/>
-              </w:rPr>
-              <w:t>10</w:t>
-            </w:r>
-          </w:p>
-        </w:tc>
-        <w:tc>
-          <w:tcPr>
-            <w:tcW w:w="1781" w:type="dxa"/>
-            <w:tcBorders/>
-          </w:tcPr>
-          <w:p>
-            <w:pPr>
-              <w:pStyle w:val="Normal"/>
-              <w:jc w:val="start"/>
-              <w:rPr/>
-            </w:pPr>
-            <w:r>
-              <w:rPr>
-                <w:sz w:val="22"/>
-                <w:szCs w:val="22"/>
-              </w:rPr>
-              <w:t>10%</w:t>
-            </w:r>
-          </w:p>
-        </w:tc>
-      </w:tr>
-      <w:tr>
-        <w:trPr/>
-        <w:tc>
-          <w:tcPr>
-            <w:tcW w:w="7699" w:type="dxa"/>
-            <w:gridSpan w:val="3"/>
-            <w:tcBorders>
-              <w:bottom w:val="single" w:sz="4" w:space="0" w:color="000000"/>
-            </w:tcBorders>
-          </w:tcPr>
-          <w:p>
-            <w:pPr>
-              <w:pStyle w:val="Normal"/>
-              <w:jc w:val="start"/>
               <w:rPr>
                 <w:sz w:val="22"/>
                 <w:szCs w:val="22"/>
@@ -2025,7 +1900,7 @@
         </w:tc>
         <w:tc>
           <w:tcPr>
-            <w:tcW w:w="1781" w:type="dxa"/>
+            <w:tcW w:w="1782" w:type="dxa"/>
             <w:tcBorders>
               <w:bottom w:val="single" w:sz="4" w:space="0" w:color="000000"/>
             </w:tcBorders>
@@ -2060,7 +1935,10 @@
         </w:rPr>
       </w:pPr>
       <w:r>
-        <w:rPr/>
+        <w:rPr>
+          <w:sz w:val="22"/>
+          <w:szCs w:val="22"/>
+        </w:rPr>
       </w:r>
     </w:p>
     <w:p>
@@ -2074,91 +1952,7 @@
           <w:sz w:val="22"/>
           <w:szCs w:val="22"/>
         </w:rPr>
-        <w:t xml:space="preserve">The Final Exam will be held at CE405 on </w:t>
-      </w:r>
-      <w:r>
-        <w:rPr>
-          <w:sz w:val="22"/>
-          <w:szCs w:val="22"/>
-        </w:rPr>
-        <w:t>Monday, December 14, 2026</w:t>
-      </w:r>
-      <w:r>
-        <w:rPr>
-          <w:sz w:val="22"/>
-          <w:szCs w:val="22"/>
-        </w:rPr>
-        <w:t xml:space="preserve">. The exam will begin at </w:t>
-      </w:r>
-      <w:r>
-        <w:rPr>
-          <w:sz w:val="22"/>
-          <w:szCs w:val="22"/>
-        </w:rPr>
-        <w:t xml:space="preserve">1645 (4:45pm)  and end at 1845 (6:45pm). Exam’s </w:t>
-      </w:r>
-      <w:r>
-        <w:rPr>
-          <w:sz w:val="22"/>
-          <w:szCs w:val="22"/>
-        </w:rPr>
-        <w:t xml:space="preserve">must be submitted to the instructor by </w:t>
-      </w:r>
-      <w:r>
-        <w:rPr>
-          <w:sz w:val="22"/>
-          <w:szCs w:val="22"/>
-        </w:rPr>
-        <w:t>1845 (6:45pm)</w:t>
-      </w:r>
-      <w:r>
-        <w:rPr>
-          <w:sz w:val="22"/>
-          <w:szCs w:val="22"/>
-        </w:rPr>
-        <w:t xml:space="preserve"> to be considered for grading. Failure to return the exam by the end</w:t>
-      </w:r>
-      <w:r>
-        <w:rPr>
-          <w:sz w:val="22"/>
-          <w:szCs w:val="22"/>
-        </w:rPr>
-        <w:t>ing</w:t>
-      </w:r>
-      <w:r>
-        <w:rPr>
-          <w:sz w:val="22"/>
-          <w:szCs w:val="22"/>
-        </w:rPr>
-        <w:t xml:space="preserve"> time will result in </w:t>
-      </w:r>
-      <w:r>
-        <w:rPr>
-          <w:sz w:val="22"/>
-          <w:szCs w:val="22"/>
-        </w:rPr>
-        <w:t>an</w:t>
-      </w:r>
-      <w:r>
-        <w:rPr>
-          <w:sz w:val="22"/>
-          <w:szCs w:val="22"/>
-        </w:rPr>
-        <w:t xml:space="preserve"> automatically </w:t>
-      </w:r>
-      <w:r>
-        <w:rPr>
-          <w:sz w:val="22"/>
-          <w:szCs w:val="22"/>
-        </w:rPr>
-        <w:t>score of</w:t>
-      </w:r>
-      <w:r>
-        <w:rPr>
-          <w:sz w:val="22"/>
-          <w:szCs w:val="22"/>
-        </w:rPr>
-        <w:t xml:space="preserve"> zero (0).</w:t>
+        <w:t>The Final Exam will be held at CE405 on Monday, December 14, 2026. The exam will begin at 1645 (4:45pm)  and end at 1845 (6:45pm). Exam’s must be submitted to the instructor by 1845 (6:45pm) to be considered for grading. Failure to return the exam by the ending time will result in an automatically score of zero (0).</w:t>
       </w:r>
     </w:p>
     <w:p>
@@ -2461,7 +2255,7 @@
     <w:p>
       <w:pPr>
         <w:pStyle w:val="Normal"/>
-        <w:spacing w:before="240" w:after="80"/>
+        <w:spacing w:before="0" w:after="80"/>
         <w:rPr>
           <w:b/>
           <w:bCs/>
@@ -2507,8 +2301,8 @@
         </w:tblCellMar>
       </w:tblPr>
       <w:tblGrid>
-        <w:gridCol w:w="699"/>
-        <w:gridCol w:w="1901"/>
+        <w:gridCol w:w="698"/>
+        <w:gridCol w:w="1902"/>
         <w:gridCol w:w="1300"/>
         <w:gridCol w:w="5580"/>
       </w:tblGrid>
@@ -2516,7 +2310,7 @@
         <w:trPr/>
         <w:tc>
           <w:tcPr>
-            <w:tcW w:w="699" w:type="dxa"/>
+            <w:tcW w:w="698" w:type="dxa"/>
             <w:tcBorders>
               <w:top w:val="single" w:sz="4" w:space="0" w:color="000000"/>
               <w:bottom w:val="single" w:sz="2" w:space="0" w:color="BFBFBF"/>
@@ -2540,7 +2334,7 @@
         </w:tc>
         <w:tc>
           <w:tcPr>
-            <w:tcW w:w="1901" w:type="dxa"/>
+            <w:tcW w:w="1902" w:type="dxa"/>
             <w:tcBorders>
               <w:top w:val="single" w:sz="4" w:space="0" w:color="000000"/>
               <w:bottom w:val="single" w:sz="2" w:space="0" w:color="BFBFBF"/>
@@ -2644,7 +2438,7 @@
         <w:trPr/>
         <w:tc>
           <w:tcPr>
-            <w:tcW w:w="699" w:type="dxa"/>
+            <w:tcW w:w="698" w:type="dxa"/>
             <w:tcBorders>
               <w:top w:val="single" w:sz="2" w:space="0" w:color="BFBFBF"/>
               <w:bottom w:val="single" w:sz="2" w:space="0" w:color="BFBFBF"/>
@@ -2668,7 +2462,7 @@
         </w:tc>
         <w:tc>
           <w:tcPr>
-            <w:tcW w:w="1901" w:type="dxa"/>
+            <w:tcW w:w="1902" w:type="dxa"/>
             <w:tcBorders>
               <w:top w:val="single" w:sz="2" w:space="0" w:color="BFBFBF"/>
               <w:bottom w:val="single" w:sz="2" w:space="0" w:color="BFBFBF"/>
@@ -2743,7 +2537,7 @@
         <w:trPr/>
         <w:tc>
           <w:tcPr>
-            <w:tcW w:w="699" w:type="dxa"/>
+            <w:tcW w:w="698" w:type="dxa"/>
             <w:tcBorders>
               <w:top w:val="single" w:sz="2" w:space="0" w:color="BFBFBF"/>
               <w:bottom w:val="single" w:sz="2" w:space="0" w:color="BFBFBF"/>
@@ -2767,7 +2561,7 @@
         </w:tc>
         <w:tc>
           <w:tcPr>
-            <w:tcW w:w="1901" w:type="dxa"/>
+            <w:tcW w:w="1902" w:type="dxa"/>
             <w:tcBorders>
               <w:top w:val="single" w:sz="2" w:space="0" w:color="BFBFBF"/>
               <w:bottom w:val="single" w:sz="2" w:space="0" w:color="BFBFBF"/>
@@ -2842,7 +2636,7 @@
         <w:trPr/>
         <w:tc>
           <w:tcPr>
-            <w:tcW w:w="699" w:type="dxa"/>
+            <w:tcW w:w="698" w:type="dxa"/>
             <w:tcBorders>
               <w:top w:val="single" w:sz="2" w:space="0" w:color="BFBFBF"/>
               <w:bottom w:val="single" w:sz="2" w:space="0" w:color="BFBFBF"/>
@@ -2866,7 +2660,7 @@
         </w:tc>
         <w:tc>
           <w:tcPr>
-            <w:tcW w:w="1901" w:type="dxa"/>
+            <w:tcW w:w="1902" w:type="dxa"/>
             <w:tcBorders>
               <w:top w:val="single" w:sz="2" w:space="0" w:color="BFBFBF"/>
               <w:bottom w:val="single" w:sz="2" w:space="0" w:color="BFBFBF"/>
@@ -2941,7 +2735,7 @@
         <w:trPr/>
         <w:tc>
           <w:tcPr>
-            <w:tcW w:w="699" w:type="dxa"/>
+            <w:tcW w:w="698" w:type="dxa"/>
             <w:tcBorders>
               <w:top w:val="single" w:sz="2" w:space="0" w:color="BFBFBF"/>
               <w:bottom w:val="single" w:sz="2" w:space="0" w:color="BFBFBF"/>
@@ -2965,7 +2759,7 @@
         </w:tc>
         <w:tc>
           <w:tcPr>
-            <w:tcW w:w="1901" w:type="dxa"/>
+            <w:tcW w:w="1902" w:type="dxa"/>
             <w:tcBorders>
               <w:top w:val="single" w:sz="2" w:space="0" w:color="BFBFBF"/>
               <w:bottom w:val="single" w:sz="2" w:space="0" w:color="BFBFBF"/>
@@ -3040,7 +2834,7 @@
         <w:trPr/>
         <w:tc>
           <w:tcPr>
-            <w:tcW w:w="699" w:type="dxa"/>
+            <w:tcW w:w="698" w:type="dxa"/>
             <w:tcBorders>
               <w:top w:val="single" w:sz="2" w:space="0" w:color="BFBFBF"/>
               <w:bottom w:val="single" w:sz="2" w:space="0" w:color="BFBFBF"/>
@@ -3064,7 +2858,7 @@
         </w:tc>
         <w:tc>
           <w:tcPr>
-            <w:tcW w:w="1901" w:type="dxa"/>
+            <w:tcW w:w="1902" w:type="dxa"/>
             <w:tcBorders>
               <w:top w:val="single" w:sz="2" w:space="0" w:color="BFBFBF"/>
               <w:bottom w:val="single" w:sz="2" w:space="0" w:color="BFBFBF"/>
@@ -3139,7 +2933,7 @@
         <w:trPr/>
         <w:tc>
           <w:tcPr>
-            <w:tcW w:w="699" w:type="dxa"/>
+            <w:tcW w:w="698" w:type="dxa"/>
             <w:tcBorders>
               <w:top w:val="single" w:sz="2" w:space="0" w:color="BFBFBF"/>
               <w:bottom w:val="single" w:sz="2" w:space="0" w:color="BFBFBF"/>
@@ -3163,7 +2957,7 @@
         </w:tc>
         <w:tc>
           <w:tcPr>
-            <w:tcW w:w="1901" w:type="dxa"/>
+            <w:tcW w:w="1902" w:type="dxa"/>
             <w:tcBorders>
               <w:top w:val="single" w:sz="2" w:space="0" w:color="BFBFBF"/>
               <w:bottom w:val="single" w:sz="2" w:space="0" w:color="BFBFBF"/>
@@ -3238,7 +3032,7 @@
         <w:trPr/>
         <w:tc>
           <w:tcPr>
-            <w:tcW w:w="699" w:type="dxa"/>
+            <w:tcW w:w="698" w:type="dxa"/>
             <w:tcBorders>
               <w:top w:val="single" w:sz="2" w:space="0" w:color="BFBFBF"/>
               <w:bottom w:val="single" w:sz="2" w:space="0" w:color="BFBFBF"/>
@@ -3262,7 +3056,7 @@
         </w:tc>
         <w:tc>
           <w:tcPr>
-            <w:tcW w:w="1901" w:type="dxa"/>
+            <w:tcW w:w="1902" w:type="dxa"/>
             <w:tcBorders>
               <w:top w:val="single" w:sz="2" w:space="0" w:color="BFBFBF"/>
               <w:bottom w:val="single" w:sz="2" w:space="0" w:color="BFBFBF"/>
@@ -3366,7 +3160,7 @@
         <w:trPr/>
         <w:tc>
           <w:tcPr>
-            <w:tcW w:w="699" w:type="dxa"/>
+            <w:tcW w:w="698" w:type="dxa"/>
             <w:tcBorders>
               <w:top w:val="single" w:sz="2" w:space="0" w:color="BFBFBF"/>
               <w:bottom w:val="single" w:sz="2" w:space="0" w:color="BFBFBF"/>
@@ -3390,7 +3184,7 @@
         </w:tc>
         <w:tc>
           <w:tcPr>
-            <w:tcW w:w="1901" w:type="dxa"/>
+            <w:tcW w:w="1902" w:type="dxa"/>
             <w:tcBorders>
               <w:top w:val="single" w:sz="2" w:space="0" w:color="BFBFBF"/>
               <w:bottom w:val="single" w:sz="2" w:space="0" w:color="BFBFBF"/>
@@ -3465,7 +3259,7 @@
         <w:trPr/>
         <w:tc>
           <w:tcPr>
-            <w:tcW w:w="699" w:type="dxa"/>
+            <w:tcW w:w="698" w:type="dxa"/>
             <w:tcBorders>
               <w:top w:val="single" w:sz="2" w:space="0" w:color="BFBFBF"/>
               <w:bottom w:val="single" w:sz="2" w:space="0" w:color="BFBFBF"/>
@@ -3489,7 +3283,7 @@
         </w:tc>
         <w:tc>
           <w:tcPr>
-            <w:tcW w:w="1901" w:type="dxa"/>
+            <w:tcW w:w="1902" w:type="dxa"/>
             <w:tcBorders>
               <w:top w:val="single" w:sz="2" w:space="0" w:color="BFBFBF"/>
               <w:bottom w:val="single" w:sz="2" w:space="0" w:color="BFBFBF"/>
@@ -3564,7 +3358,7 @@
         <w:trPr/>
         <w:tc>
           <w:tcPr>
-            <w:tcW w:w="699" w:type="dxa"/>
+            <w:tcW w:w="698" w:type="dxa"/>
             <w:tcBorders>
               <w:top w:val="single" w:sz="2" w:space="0" w:color="BFBFBF"/>
               <w:bottom w:val="single" w:sz="2" w:space="0" w:color="BFBFBF"/>
@@ -3588,7 +3382,7 @@
         </w:tc>
         <w:tc>
           <w:tcPr>
-            <w:tcW w:w="1901" w:type="dxa"/>
+            <w:tcW w:w="1902" w:type="dxa"/>
             <w:tcBorders>
               <w:top w:val="single" w:sz="2" w:space="0" w:color="BFBFBF"/>
               <w:bottom w:val="single" w:sz="2" w:space="0" w:color="BFBFBF"/>
@@ -3663,7 +3457,7 @@
         <w:trPr/>
         <w:tc>
           <w:tcPr>
-            <w:tcW w:w="699" w:type="dxa"/>
+            <w:tcW w:w="698" w:type="dxa"/>
             <w:tcBorders>
               <w:top w:val="single" w:sz="2" w:space="0" w:color="BFBFBF"/>
               <w:bottom w:val="single" w:sz="2" w:space="0" w:color="BFBFBF"/>
@@ -3687,7 +3481,7 @@
         </w:tc>
         <w:tc>
           <w:tcPr>
-            <w:tcW w:w="1901" w:type="dxa"/>
+            <w:tcW w:w="1902" w:type="dxa"/>
             <w:tcBorders>
               <w:top w:val="single" w:sz="2" w:space="0" w:color="BFBFBF"/>
               <w:bottom w:val="single" w:sz="2" w:space="0" w:color="BFBFBF"/>
@@ -3762,7 +3556,7 @@
         <w:trPr/>
         <w:tc>
           <w:tcPr>
-            <w:tcW w:w="699" w:type="dxa"/>
+            <w:tcW w:w="698" w:type="dxa"/>
             <w:tcBorders>
               <w:top w:val="single" w:sz="2" w:space="0" w:color="BFBFBF"/>
               <w:bottom w:val="single" w:sz="2" w:space="0" w:color="BFBFBF"/>
@@ -3786,7 +3580,7 @@
         </w:tc>
         <w:tc>
           <w:tcPr>
-            <w:tcW w:w="1901" w:type="dxa"/>
+            <w:tcW w:w="1902" w:type="dxa"/>
             <w:tcBorders>
               <w:top w:val="single" w:sz="2" w:space="0" w:color="BFBFBF"/>
               <w:bottom w:val="single" w:sz="2" w:space="0" w:color="BFBFBF"/>
@@ -3861,7 +3655,7 @@
         <w:trPr/>
         <w:tc>
           <w:tcPr>
-            <w:tcW w:w="699" w:type="dxa"/>
+            <w:tcW w:w="698" w:type="dxa"/>
             <w:tcBorders>
               <w:top w:val="single" w:sz="2" w:space="0" w:color="BFBFBF"/>
               <w:bottom w:val="single" w:sz="2" w:space="0" w:color="BFBFBF"/>
@@ -3885,7 +3679,7 @@
         </w:tc>
         <w:tc>
           <w:tcPr>
-            <w:tcW w:w="1901" w:type="dxa"/>
+            <w:tcW w:w="1902" w:type="dxa"/>
             <w:tcBorders>
               <w:top w:val="single" w:sz="2" w:space="0" w:color="BFBFBF"/>
               <w:bottom w:val="single" w:sz="2" w:space="0" w:color="BFBFBF"/>
@@ -3960,7 +3754,7 @@
         <w:trPr/>
         <w:tc>
           <w:tcPr>
-            <w:tcW w:w="699" w:type="dxa"/>
+            <w:tcW w:w="698" w:type="dxa"/>
             <w:tcBorders>
               <w:top w:val="single" w:sz="2" w:space="0" w:color="BFBFBF"/>
               <w:bottom w:val="single" w:sz="2" w:space="0" w:color="BFBFBF"/>
@@ -3984,7 +3778,7 @@
         </w:tc>
         <w:tc>
           <w:tcPr>
-            <w:tcW w:w="1901" w:type="dxa"/>
+            <w:tcW w:w="1902" w:type="dxa"/>
             <w:tcBorders>
               <w:top w:val="single" w:sz="2" w:space="0" w:color="BFBFBF"/>
               <w:bottom w:val="single" w:sz="2" w:space="0" w:color="BFBFBF"/>
@@ -4088,7 +3882,7 @@
         <w:trPr/>
         <w:tc>
           <w:tcPr>
-            <w:tcW w:w="699" w:type="dxa"/>
+            <w:tcW w:w="698" w:type="dxa"/>
             <w:tcBorders>
               <w:top w:val="single" w:sz="2" w:space="0" w:color="BFBFBF"/>
               <w:bottom w:val="single" w:sz="2" w:space="0" w:color="BFBFBF"/>
@@ -4112,7 +3906,7 @@
         </w:tc>
         <w:tc>
           <w:tcPr>
-            <w:tcW w:w="1901" w:type="dxa"/>
+            <w:tcW w:w="1902" w:type="dxa"/>
             <w:tcBorders>
               <w:top w:val="single" w:sz="2" w:space="0" w:color="BFBFBF"/>
               <w:bottom w:val="single" w:sz="2" w:space="0" w:color="BFBFBF"/>
@@ -4187,7 +3981,7 @@
         <w:trPr/>
         <w:tc>
           <w:tcPr>
-            <w:tcW w:w="699" w:type="dxa"/>
+            <w:tcW w:w="698" w:type="dxa"/>
             <w:tcBorders>
               <w:top w:val="single" w:sz="2" w:space="0" w:color="BFBFBF"/>
               <w:bottom w:val="single" w:sz="2" w:space="0" w:color="BFBFBF"/>
@@ -4211,7 +4005,7 @@
         </w:tc>
         <w:tc>
           <w:tcPr>
-            <w:tcW w:w="1901" w:type="dxa"/>
+            <w:tcW w:w="1902" w:type="dxa"/>
             <w:tcBorders>
               <w:top w:val="single" w:sz="2" w:space="0" w:color="BFBFBF"/>
               <w:bottom w:val="single" w:sz="2" w:space="0" w:color="BFBFBF"/>
@@ -4286,7 +4080,7 @@
         <w:trPr/>
         <w:tc>
           <w:tcPr>
-            <w:tcW w:w="699" w:type="dxa"/>
+            <w:tcW w:w="698" w:type="dxa"/>
             <w:tcBorders>
               <w:top w:val="single" w:sz="2" w:space="0" w:color="BFBFBF"/>
               <w:bottom w:val="single" w:sz="2" w:space="0" w:color="BFBFBF"/>
@@ -4310,7 +4104,7 @@
         </w:tc>
         <w:tc>
           <w:tcPr>
-            <w:tcW w:w="1901" w:type="dxa"/>
+            <w:tcW w:w="1902" w:type="dxa"/>
             <w:tcBorders>
               <w:top w:val="single" w:sz="2" w:space="0" w:color="BFBFBF"/>
               <w:bottom w:val="single" w:sz="2" w:space="0" w:color="BFBFBF"/>
@@ -4385,7 +4179,7 @@
         <w:trPr/>
         <w:tc>
           <w:tcPr>
-            <w:tcW w:w="699" w:type="dxa"/>
+            <w:tcW w:w="698" w:type="dxa"/>
             <w:tcBorders>
               <w:top w:val="single" w:sz="2" w:space="0" w:color="BFBFBF"/>
               <w:bottom w:val="single" w:sz="2" w:space="0" w:color="BFBFBF"/>
@@ -4409,7 +4203,7 @@
         </w:tc>
         <w:tc>
           <w:tcPr>
-            <w:tcW w:w="1901" w:type="dxa"/>
+            <w:tcW w:w="1902" w:type="dxa"/>
             <w:tcBorders>
               <w:top w:val="single" w:sz="2" w:space="0" w:color="BFBFBF"/>
               <w:bottom w:val="single" w:sz="2" w:space="0" w:color="BFBFBF"/>
@@ -4484,7 +4278,7 @@
         <w:trPr/>
         <w:tc>
           <w:tcPr>
-            <w:tcW w:w="699" w:type="dxa"/>
+            <w:tcW w:w="698" w:type="dxa"/>
             <w:tcBorders>
               <w:top w:val="single" w:sz="2" w:space="0" w:color="BFBFBF"/>
               <w:bottom w:val="single" w:sz="2" w:space="0" w:color="BFBFBF"/>
@@ -4508,7 +4302,7 @@
         </w:tc>
         <w:tc>
           <w:tcPr>
-            <w:tcW w:w="1901" w:type="dxa"/>
+            <w:tcW w:w="1902" w:type="dxa"/>
             <w:tcBorders>
               <w:top w:val="single" w:sz="2" w:space="0" w:color="BFBFBF"/>
               <w:bottom w:val="single" w:sz="2" w:space="0" w:color="BFBFBF"/>
@@ -4583,7 +4377,7 @@
         <w:trPr/>
         <w:tc>
           <w:tcPr>
-            <w:tcW w:w="699" w:type="dxa"/>
+            <w:tcW w:w="698" w:type="dxa"/>
             <w:tcBorders>
               <w:top w:val="single" w:sz="2" w:space="0" w:color="BFBFBF"/>
               <w:bottom w:val="single" w:sz="2" w:space="0" w:color="BFBFBF"/>
@@ -4607,7 +4401,7 @@
         </w:tc>
         <w:tc>
           <w:tcPr>
-            <w:tcW w:w="1901" w:type="dxa"/>
+            <w:tcW w:w="1902" w:type="dxa"/>
             <w:tcBorders>
               <w:top w:val="single" w:sz="2" w:space="0" w:color="BFBFBF"/>
               <w:bottom w:val="single" w:sz="2" w:space="0" w:color="BFBFBF"/>
@@ -4711,7 +4505,7 @@
         <w:trPr/>
         <w:tc>
           <w:tcPr>
-            <w:tcW w:w="699" w:type="dxa"/>
+            <w:tcW w:w="698" w:type="dxa"/>
             <w:tcBorders>
               <w:top w:val="single" w:sz="2" w:space="0" w:color="BFBFBF"/>
               <w:bottom w:val="single" w:sz="2" w:space="0" w:color="BFBFBF"/>
@@ -4735,7 +4529,7 @@
         </w:tc>
         <w:tc>
           <w:tcPr>
-            <w:tcW w:w="1901" w:type="dxa"/>
+            <w:tcW w:w="1902" w:type="dxa"/>
             <w:tcBorders>
               <w:top w:val="single" w:sz="2" w:space="0" w:color="BFBFBF"/>
               <w:bottom w:val="single" w:sz="2" w:space="0" w:color="BFBFBF"/>
@@ -4810,7 +4604,7 @@
         <w:trPr/>
         <w:tc>
           <w:tcPr>
-            <w:tcW w:w="699" w:type="dxa"/>
+            <w:tcW w:w="698" w:type="dxa"/>
             <w:tcBorders>
               <w:top w:val="single" w:sz="2" w:space="0" w:color="BFBFBF"/>
               <w:bottom w:val="single" w:sz="2" w:space="0" w:color="BFBFBF"/>
@@ -4834,7 +4628,7 @@
         </w:tc>
         <w:tc>
           <w:tcPr>
-            <w:tcW w:w="1901" w:type="dxa"/>
+            <w:tcW w:w="1902" w:type="dxa"/>
             <w:tcBorders>
               <w:top w:val="single" w:sz="2" w:space="0" w:color="BFBFBF"/>
               <w:bottom w:val="single" w:sz="2" w:space="0" w:color="BFBFBF"/>
@@ -4909,7 +4703,7 @@
         <w:trPr/>
         <w:tc>
           <w:tcPr>
-            <w:tcW w:w="699" w:type="dxa"/>
+            <w:tcW w:w="698" w:type="dxa"/>
             <w:tcBorders>
               <w:top w:val="single" w:sz="2" w:space="0" w:color="BFBFBF"/>
               <w:bottom w:val="single" w:sz="2" w:space="0" w:color="BFBFBF"/>
@@ -4933,7 +4727,7 @@
         </w:tc>
         <w:tc>
           <w:tcPr>
-            <w:tcW w:w="1901" w:type="dxa"/>
+            <w:tcW w:w="1902" w:type="dxa"/>
             <w:tcBorders>
               <w:top w:val="single" w:sz="2" w:space="0" w:color="BFBFBF"/>
               <w:bottom w:val="single" w:sz="2" w:space="0" w:color="BFBFBF"/>
@@ -5008,7 +4802,7 @@
         <w:trPr/>
         <w:tc>
           <w:tcPr>
-            <w:tcW w:w="699" w:type="dxa"/>
+            <w:tcW w:w="698" w:type="dxa"/>
             <w:tcBorders>
               <w:top w:val="single" w:sz="2" w:space="0" w:color="BFBFBF"/>
               <w:bottom w:val="single" w:sz="2" w:space="0" w:color="BFBFBF"/>
@@ -5032,7 +4826,7 @@
         </w:tc>
         <w:tc>
           <w:tcPr>
-            <w:tcW w:w="1901" w:type="dxa"/>
+            <w:tcW w:w="1902" w:type="dxa"/>
             <w:tcBorders>
               <w:top w:val="single" w:sz="2" w:space="0" w:color="BFBFBF"/>
               <w:bottom w:val="single" w:sz="2" w:space="0" w:color="BFBFBF"/>
@@ -5107,7 +4901,7 @@
         <w:trPr/>
         <w:tc>
           <w:tcPr>
-            <w:tcW w:w="699" w:type="dxa"/>
+            <w:tcW w:w="698" w:type="dxa"/>
             <w:tcBorders>
               <w:top w:val="single" w:sz="2" w:space="0" w:color="BFBFBF"/>
               <w:bottom w:val="single" w:sz="2" w:space="0" w:color="BFBFBF"/>
@@ -5131,7 +4925,7 @@
         </w:tc>
         <w:tc>
           <w:tcPr>
-            <w:tcW w:w="1901" w:type="dxa"/>
+            <w:tcW w:w="1902" w:type="dxa"/>
             <w:tcBorders>
               <w:top w:val="single" w:sz="2" w:space="0" w:color="BFBFBF"/>
               <w:bottom w:val="single" w:sz="2" w:space="0" w:color="BFBFBF"/>
@@ -5206,7 +5000,7 @@
         <w:trPr/>
         <w:tc>
           <w:tcPr>
-            <w:tcW w:w="699" w:type="dxa"/>
+            <w:tcW w:w="698" w:type="dxa"/>
             <w:tcBorders>
               <w:top w:val="single" w:sz="2" w:space="0" w:color="BFBFBF"/>
               <w:bottom w:val="single" w:sz="2" w:space="0" w:color="BFBFBF"/>
@@ -5230,7 +5024,7 @@
         </w:tc>
         <w:tc>
           <w:tcPr>
-            <w:tcW w:w="1901" w:type="dxa"/>
+            <w:tcW w:w="1902" w:type="dxa"/>
             <w:tcBorders>
               <w:top w:val="single" w:sz="2" w:space="0" w:color="BFBFBF"/>
               <w:bottom w:val="single" w:sz="2" w:space="0" w:color="BFBFBF"/>
@@ -5334,7 +5128,7 @@
         <w:trPr/>
         <w:tc>
           <w:tcPr>
-            <w:tcW w:w="699" w:type="dxa"/>
+            <w:tcW w:w="698" w:type="dxa"/>
             <w:tcBorders>
               <w:top w:val="single" w:sz="2" w:space="0" w:color="BFBFBF"/>
               <w:bottom w:val="single" w:sz="4" w:space="0" w:color="000000"/>
@@ -5358,7 +5152,7 @@
         </w:tc>
         <w:tc>
           <w:tcPr>
-            <w:tcW w:w="1901" w:type="dxa"/>
+            <w:tcW w:w="1902" w:type="dxa"/>
             <w:tcBorders>
               <w:top w:val="single" w:sz="2" w:space="0" w:color="BFBFBF"/>
               <w:bottom w:val="single" w:sz="4" w:space="0" w:color="000000"/>
@@ -5376,25 +5170,7 @@
                 <w:sz w:val="20"/>
                 <w:szCs w:val="20"/>
               </w:rPr>
-              <w:t>December 1</w:t>
-            </w:r>
-            <w:r>
-              <w:rPr>
-                <w:b w:val="false"/>
-                <w:bCs w:val="false"/>
-                <w:sz w:val="20"/>
-                <w:szCs w:val="20"/>
-              </w:rPr>
-              <w:t>4,</w:t>
-            </w:r>
-            <w:r>
-              <w:rPr>
-                <w:b w:val="false"/>
-                <w:bCs w:val="false"/>
-                <w:sz w:val="20"/>
-                <w:szCs w:val="20"/>
-              </w:rPr>
-              <w:t xml:space="preserve"> 2026</w:t>
+              <w:t>December 14, 2026</w:t>
             </w:r>
           </w:p>
         </w:tc>
@@ -5507,6 +5283,7 @@
         </w:tabs>
         <w:ind w:start="1080" w:hanging="360"/>
       </w:pPr>
+      <w:rPr/>
     </w:lvl>
     <w:lvl w:ilvl="2">
       <w:start w:val="1"/>
@@ -5519,6 +5296,7 @@
         </w:tabs>
         <w:ind w:start="1440" w:hanging="360"/>
       </w:pPr>
+      <w:rPr/>
     </w:lvl>
     <w:lvl w:ilvl="3">
       <w:start w:val="1"/>
@@ -5531,6 +5309,7 @@
         </w:tabs>
         <w:ind w:start="1800" w:hanging="360"/>
       </w:pPr>
+      <w:rPr/>
     </w:lvl>
     <w:lvl w:ilvl="4">
       <w:start w:val="1"/>
@@ -5543,6 +5322,7 @@
         </w:tabs>
         <w:ind w:start="2160" w:hanging="360"/>
       </w:pPr>
+      <w:rPr/>
     </w:lvl>
     <w:lvl w:ilvl="5">
       <w:start w:val="1"/>
@@ -5555,6 +5335,7 @@
         </w:tabs>
         <w:ind w:start="2520" w:hanging="360"/>
       </w:pPr>
+      <w:rPr/>
     </w:lvl>
     <w:lvl w:ilvl="6">
       <w:start w:val="1"/>
@@ -5567,6 +5348,7 @@
         </w:tabs>
         <w:ind w:start="2880" w:hanging="360"/>
       </w:pPr>
+      <w:rPr/>
     </w:lvl>
     <w:lvl w:ilvl="7">
       <w:start w:val="1"/>
@@ -5579,6 +5361,7 @@
         </w:tabs>
         <w:ind w:start="3240" w:hanging="360"/>
       </w:pPr>
+      <w:rPr/>
     </w:lvl>
     <w:lvl w:ilvl="8">
       <w:start w:val="1"/>
@@ -5591,9 +5374,132 @@
         </w:tabs>
         <w:ind w:start="3600" w:hanging="360"/>
       </w:pPr>
+      <w:rPr/>
     </w:lvl>
   </w:abstractNum>
   <w:abstractNum w:abstractNumId="2">
+    <w:lvl w:ilvl="0">
+      <w:start w:val="1"/>
+      <w:numFmt w:val="decimal"/>
+      <w:lvlText w:val="%1."/>
+      <w:lvlJc w:val="start"/>
+      <w:pPr>
+        <w:tabs>
+          <w:tab w:val="num" w:pos="0"/>
+        </w:tabs>
+        <w:ind w:start="720" w:hanging="360"/>
+      </w:pPr>
+      <w:rPr>
+        <w:sz w:val="22"/>
+        <w:szCs w:val="22"/>
+      </w:rPr>
+    </w:lvl>
+    <w:lvl w:ilvl="1">
+      <w:start w:val="1"/>
+      <w:numFmt w:val="decimal"/>
+      <w:lvlText w:val="%2."/>
+      <w:lvlJc w:val="start"/>
+      <w:pPr>
+        <w:tabs>
+          <w:tab w:val="num" w:pos="1080"/>
+        </w:tabs>
+        <w:ind w:start="1080" w:hanging="360"/>
+      </w:pPr>
+      <w:rPr/>
+    </w:lvl>
+    <w:lvl w:ilvl="2">
+      <w:start w:val="1"/>
+      <w:numFmt w:val="decimal"/>
+      <w:lvlText w:val="%3."/>
+      <w:lvlJc w:val="start"/>
+      <w:pPr>
+        <w:tabs>
+          <w:tab w:val="num" w:pos="1440"/>
+        </w:tabs>
+        <w:ind w:start="1440" w:hanging="360"/>
+      </w:pPr>
+      <w:rPr/>
+    </w:lvl>
+    <w:lvl w:ilvl="3">
+      <w:start w:val="1"/>
+      <w:numFmt w:val="decimal"/>
+      <w:lvlText w:val="%4."/>
+      <w:lvlJc w:val="start"/>
+      <w:pPr>
+        <w:tabs>
+          <w:tab w:val="num" w:pos="1800"/>
+        </w:tabs>
+        <w:ind w:start="1800" w:hanging="360"/>
+      </w:pPr>
+      <w:rPr/>
+    </w:lvl>
+    <w:lvl w:ilvl="4">
+      <w:start w:val="1"/>
+      <w:numFmt w:val="decimal"/>
+      <w:lvlText w:val="%5."/>
+      <w:lvlJc w:val="start"/>
+      <w:pPr>
+        <w:tabs>
+          <w:tab w:val="num" w:pos="2160"/>
+        </w:tabs>
+        <w:ind w:start="2160" w:hanging="360"/>
+      </w:pPr>
+      <w:rPr/>
+    </w:lvl>
+    <w:lvl w:ilvl="5">
+      <w:start w:val="1"/>
+      <w:numFmt w:val="decimal"/>
+      <w:lvlText w:val="%6."/>
+      <w:lvlJc w:val="start"/>
+      <w:pPr>
+        <w:tabs>
+          <w:tab w:val="num" w:pos="2520"/>
+        </w:tabs>
+        <w:ind w:start="2520" w:hanging="360"/>
+      </w:pPr>
+      <w:rPr/>
+    </w:lvl>
+    <w:lvl w:ilvl="6">
+      <w:start w:val="1"/>
+      <w:numFmt w:val="decimal"/>
+      <w:lvlText w:val="%7."/>
+      <w:lvlJc w:val="start"/>
+      <w:pPr>
+        <w:tabs>
+          <w:tab w:val="num" w:pos="2880"/>
+        </w:tabs>
+        <w:ind w:start="2880" w:hanging="360"/>
+      </w:pPr>
+      <w:rPr/>
+    </w:lvl>
+    <w:lvl w:ilvl="7">
+      <w:start w:val="1"/>
+      <w:numFmt w:val="decimal"/>
+      <w:lvlText w:val="%8."/>
+      <w:lvlJc w:val="start"/>
+      <w:pPr>
+        <w:tabs>
+          <w:tab w:val="num" w:pos="3240"/>
+        </w:tabs>
+        <w:ind w:start="3240" w:hanging="360"/>
+      </w:pPr>
+      <w:rPr/>
+    </w:lvl>
+    <w:lvl w:ilvl="8">
+      <w:start w:val="1"/>
+      <w:numFmt w:val="decimal"/>
+      <w:lvlText w:val="%9."/>
+      <w:lvlJc w:val="start"/>
+      <w:pPr>
+        <w:tabs>
+          <w:tab w:val="num" w:pos="3600"/>
+        </w:tabs>
+        <w:ind w:start="3600" w:hanging="360"/>
+      </w:pPr>
+      <w:rPr/>
+    </w:lvl>
+  </w:abstractNum>
+  <w:abstractNum w:abstractNumId="3">
     <w:lvl w:ilvl="0">
       <w:start w:val="1"/>
       <w:numFmt w:val="none"/>
@@ -5719,7 +5625,10 @@
     <w:abstractNumId w:val="2"/>
   </w:num>
   <w:num w:numId="3">
-    <w:abstractNumId w:val="1"/>
+    <w:abstractNumId w:val="3"/>
+  </w:num>
+  <w:num w:numId="4">
+    <w:abstractNumId w:val="2"/>
     <w:lvlOverride w:ilvl="0">
       <w:startOverride w:val="1"/>
     </w:lvlOverride>
@@ -5747,6 +5656,7 @@
     <w:qFormat/>
     <w:pPr>
       <w:widowControl/>
+      <w:suppressAutoHyphens w:val="true"/>
       <w:bidi w:val="0"/>
       <w:spacing w:before="0" w:after="0"/>
       <w:jc w:val="start"/>
@@ -5831,11 +5741,18 @@
       <w:u w:val="single"/>
     </w:rPr>
   </w:style>
-  <w:style w:type="character" w:styleId="FootnoteCharacters">
-    <w:name w:val="Footnote Characters"/>
+  <w:style w:type="character" w:styleId="FootnoteCharactersuser">
+    <w:name w:val="Footnote Characters (user)"/>
     <w:uiPriority w:val="99"/>
     <w:semiHidden/>
     <w:unhideWhenUsed/>
+    <w:qFormat/>
+    <w:rPr>
+      <w:vertAlign w:val="superscript"/>
+    </w:rPr>
+  </w:style>
+  <w:style w:type="character" w:styleId="FootnoteCharacters">
+    <w:name w:val="Footnote Characters"/>
     <w:qFormat/>
     <w:rPr>
       <w:vertAlign w:val="superscript"/>
@@ -5859,11 +5776,18 @@
       <w:szCs w:val="20"/>
     </w:rPr>
   </w:style>
-  <w:style w:type="character" w:styleId="EndnoteCharacters">
-    <w:name w:val="Endnote Characters"/>
+  <w:style w:type="character" w:styleId="EndnoteCharactersuser">
+    <w:name w:val="Endnote Characters (user)"/>
     <w:uiPriority w:val="99"/>
     <w:semiHidden/>
     <w:unhideWhenUsed/>
+    <w:qFormat/>
+    <w:rPr>
+      <w:vertAlign w:val="superscript"/>
+    </w:rPr>
+  </w:style>
+  <w:style w:type="character" w:styleId="EndnoteCharacters">
+    <w:name w:val="Endnote Characters"/>
     <w:qFormat/>
     <w:rPr>
       <w:vertAlign w:val="superscript"/>
@@ -5960,6 +5884,7 @@
     <w:qFormat/>
     <w:pPr>
       <w:widowControl/>
+      <w:suppressAutoHyphens w:val="true"/>
       <w:bidi w:val="0"/>
       <w:spacing w:before="0" w:after="0"/>
       <w:jc w:val="start"/>
@@ -5980,6 +5905,7 @@
     <w:qFormat/>
     <w:pPr>
       <w:widowControl/>
+      <w:suppressAutoHyphens w:val="true"/>
       <w:bidi w:val="0"/>
       <w:spacing w:before="0" w:after="0"/>
       <w:jc w:val="start"/>

</xml_diff>